<commit_message>
Archive and clean up MLflow experiment runs
Cleaning up old mlflow experiment runs. Also added new experiment run data under mlruns/0, including metrics, parameters, and metadata for new model training sessions. Minor updates were made to README.md and docs/MLOps_Report.docx.
</commit_message>
<xml_diff>
--- a/docs/MLOps_Report.docx
+++ b/docs/MLOps_Report.docx
@@ -112,17 +112,7 @@
     </w:p>
     <w:p>
       <w:r>
-        <w:t>1. Implement MLflow pyfunc wrapper for SARIMAX and log it during training.</w:t>
-      </w:r>
-    </w:p>
-    <w:p>
-      <w:r>
-        <w:t>2. Add automated CI that runs unit tests and a quick training smoke test on PRs.</w:t>
-      </w:r>
-    </w:p>
-    <w:p>
-      <w:r>
-        <w:t>3. Add Dockerfile and docker-compose to run the app + Prometheus + Grafana locally for end-to-end testing.</w:t>
+        <w:t>Add Dockerfile and docker-compose to run the app + Prometheus + Grafana locally for end-to-end testing.</w:t>
       </w:r>
     </w:p>
     <w:sectPr>

</xml_diff>